<commit_message>
Add GitHub link to Word document
</commit_message>
<xml_diff>
--- a/Harmanpreet_Kaur_Powershell Lab4.docx
+++ b/Harmanpreet_Kaur_Powershell Lab4.docx
@@ -69,6 +69,35 @@
         </w:rPr>
         <w:t>GitHub repository:</w:t>
       </w:r>
+      <w:r>
+        <w:rPr>
+          <w:rFonts w:ascii="Times New Roman" w:eastAsia="Times New Roman" w:hAnsi="Times New Roman" w:cs="Times New Roman"/>
+          <w:b/>
+          <w:bCs/>
+          <w:kern w:val="0"/>
+          <w:lang w:eastAsia="en-CA"/>
+          <w14:ligatures w14:val="none"/>
+        </w:rPr>
+        <w:t xml:space="preserve"> </w:t>
+      </w:r>
+      <w:hyperlink r:id="rId4" w:history="1">
+        <w:r>
+          <w:rPr>
+            <w:rStyle w:val="Hyperlink"/>
+            <w:b/>
+            <w:bCs/>
+          </w:rPr>
+          <w:t>https://github.com/PreetHaarman/powershell-lab4-importexcel</w:t>
+        </w:r>
+      </w:hyperlink>
+    </w:p>
+    <w:p>
+      <w:pPr>
+        <w:rPr>
+          <w:b/>
+          <w:bCs/>
+        </w:rPr>
+      </w:pPr>
     </w:p>
     <w:p>
       <w:pPr>
@@ -157,6 +186,7 @@
         <w:rPr>
           <w:b/>
           <w:bCs/>
+          <w:noProof/>
         </w:rPr>
         <w:drawing>
           <wp:inline distT="0" distB="0" distL="0" distR="0" wp14:anchorId="15F86AC7" wp14:editId="739DDDC3">
@@ -171,196 +201,6 @@
                 <pic:pic xmlns:pic="http://schemas.openxmlformats.org/drawingml/2006/picture">
                   <pic:nvPicPr>
                     <pic:cNvPr id="1060840016" name=""/>
-                    <pic:cNvPicPr/>
-                  </pic:nvPicPr>
-                  <pic:blipFill>
-                    <a:blip r:embed="rId4"/>
-                    <a:stretch>
-                      <a:fillRect/>
-                    </a:stretch>
-                  </pic:blipFill>
-                  <pic:spPr>
-                    <a:xfrm>
-                      <a:off x="0" y="0"/>
-                      <a:ext cx="5943600" cy="3714750"/>
-                    </a:xfrm>
-                    <a:prstGeom prst="rect">
-                      <a:avLst/>
-                    </a:prstGeom>
-                  </pic:spPr>
-                </pic:pic>
-              </a:graphicData>
-            </a:graphic>
-          </wp:inline>
-        </w:drawing>
-      </w:r>
-    </w:p>
-    <w:p>
-      <w:r>
-        <w:rPr>
-          <w:b/>
-          <w:bCs/>
-        </w:rPr>
-        <w:t xml:space="preserve">Output: </w:t>
-      </w:r>
-      <w:r>
-        <w:rPr>
-          <w:highlight w:val="yellow"/>
-        </w:rPr>
-        <w:t xml:space="preserve">This command downloads and installs the </w:t>
-      </w:r>
-      <w:proofErr w:type="spellStart"/>
-      <w:r>
-        <w:rPr>
-          <w:highlight w:val="yellow"/>
-        </w:rPr>
-        <w:t>ImportExcel</w:t>
-      </w:r>
-      <w:proofErr w:type="spellEnd"/>
-      <w:r>
-        <w:rPr>
-          <w:highlight w:val="yellow"/>
-        </w:rPr>
-        <w:t xml:space="preserve"> module from the </w:t>
-      </w:r>
-      <w:r>
-        <w:rPr>
-          <w:highlight w:val="yellow"/>
-        </w:rPr>
-        <w:t>PowerShell gallery</w:t>
-      </w:r>
-      <w:r>
-        <w:rPr>
-          <w:highlight w:val="yellow"/>
-        </w:rPr>
-        <w:t xml:space="preserve">. This module </w:t>
-      </w:r>
-      <w:r>
-        <w:rPr>
-          <w:highlight w:val="yellow"/>
-        </w:rPr>
-        <w:t xml:space="preserve">gives me command such as </w:t>
-      </w:r>
-      <w:r>
-        <w:rPr>
-          <w:highlight w:val="yellow"/>
-        </w:rPr>
-        <w:t>Import-Excel and Export-Excel</w:t>
-      </w:r>
-      <w:r>
-        <w:rPr>
-          <w:highlight w:val="yellow"/>
-        </w:rPr>
-        <w:t xml:space="preserve"> that I use to read and write excel files. </w:t>
-      </w:r>
-      <w:r>
-        <w:rPr>
-          <w:highlight w:val="yellow"/>
-        </w:rPr>
-        <w:t>What I like about this module is that it does not need Microsoft Excel.</w:t>
-      </w:r>
-      <w:r>
-        <w:rPr>
-          <w:highlight w:val="yellow"/>
-        </w:rPr>
-        <w:t xml:space="preserve"> </w:t>
-      </w:r>
-      <w:r>
-        <w:rPr>
-          <w:highlight w:val="yellow"/>
-        </w:rPr>
-        <w:t xml:space="preserve">It reads and writes the </w:t>
-      </w:r>
-      <w:r>
-        <w:rPr>
-          <w:highlight w:val="yellow"/>
-        </w:rPr>
-        <w:t>excel</w:t>
-      </w:r>
-      <w:r>
-        <w:rPr>
-          <w:highlight w:val="yellow"/>
-        </w:rPr>
-        <w:t xml:space="preserve"> file directly, so I can put it on a server without </w:t>
-      </w:r>
-      <w:r>
-        <w:rPr>
-          <w:highlight w:val="yellow"/>
-        </w:rPr>
-        <w:lastRenderedPageBreak/>
-        <w:t>installing</w:t>
-      </w:r>
-      <w:r>
-        <w:rPr>
-          <w:highlight w:val="yellow"/>
-        </w:rPr>
-        <w:t xml:space="preserve"> Microsoft</w:t>
-      </w:r>
-      <w:r>
-        <w:rPr>
-          <w:highlight w:val="yellow"/>
-        </w:rPr>
-        <w:t xml:space="preserve"> Office </w:t>
-      </w:r>
-      <w:r>
-        <w:rPr>
-          <w:highlight w:val="yellow"/>
-        </w:rPr>
-        <w:t xml:space="preserve">there. I ran command Install-Module -Name </w:t>
-      </w:r>
-      <w:proofErr w:type="spellStart"/>
-      <w:r>
-        <w:rPr>
-          <w:highlight w:val="yellow"/>
-        </w:rPr>
-        <w:t>ImportExcel</w:t>
-      </w:r>
-      <w:proofErr w:type="spellEnd"/>
-      <w:r>
-        <w:rPr>
-          <w:highlight w:val="yellow"/>
-        </w:rPr>
-        <w:t xml:space="preserve"> and I didn’t get any red error, so it means this command worked.</w:t>
-      </w:r>
-      <w:r>
-        <w:t xml:space="preserve"> </w:t>
-      </w:r>
-    </w:p>
-    <w:p/>
-    <w:p>
-      <w:pPr>
-        <w:rPr>
-          <w:b/>
-          <w:bCs/>
-          <w:sz w:val="28"/>
-          <w:szCs w:val="28"/>
-        </w:rPr>
-      </w:pPr>
-      <w:r>
-        <w:rPr>
-          <w:b/>
-          <w:bCs/>
-          <w:sz w:val="28"/>
-          <w:szCs w:val="28"/>
-        </w:rPr>
-        <w:t>Step 2: Copy Fruits .xlsx to the server</w:t>
-      </w:r>
-    </w:p>
-    <w:p>
-      <w:r>
-        <w:drawing>
-          <wp:inline distT="0" distB="0" distL="0" distR="0" wp14:anchorId="4337B1D3" wp14:editId="0F9FF2CA">
-            <wp:extent cx="5943600" cy="3714750"/>
-            <wp:effectExtent l="0" t="0" r="0" b="0"/>
-            <wp:docPr id="1109721744" name="Picture 1"/>
-            <wp:cNvGraphicFramePr>
-              <a:graphicFrameLocks xmlns:a="http://schemas.openxmlformats.org/drawingml/2006/main" noChangeAspect="1"/>
-            </wp:cNvGraphicFramePr>
-            <a:graphic xmlns:a="http://schemas.openxmlformats.org/drawingml/2006/main">
-              <a:graphicData uri="http://schemas.openxmlformats.org/drawingml/2006/picture">
-                <pic:pic xmlns:pic="http://schemas.openxmlformats.org/drawingml/2006/picture">
-                  <pic:nvPicPr>
-                    <pic:cNvPr id="1109721744" name=""/>
                     <pic:cNvPicPr/>
                   </pic:nvPicPr>
                   <pic:blipFill>
@@ -386,222 +226,106 @@
       </w:r>
     </w:p>
     <w:p>
-      <w:pPr>
-        <w:spacing w:after="120" w:line="276" w:lineRule="auto"/>
-      </w:pPr>
-      <w:r>
+      <w:r>
+        <w:rPr>
+          <w:b/>
+          <w:bCs/>
+        </w:rPr>
+        <w:t xml:space="preserve">Output: </w:t>
+      </w:r>
+      <w:r>
+        <w:rPr>
+          <w:highlight w:val="yellow"/>
+        </w:rPr>
+        <w:t xml:space="preserve">This command downloads and installs the </w:t>
+      </w:r>
+      <w:proofErr w:type="spellStart"/>
+      <w:r>
+        <w:rPr>
+          <w:highlight w:val="yellow"/>
+        </w:rPr>
+        <w:t>ImportExcel</w:t>
+      </w:r>
+      <w:proofErr w:type="spellEnd"/>
+      <w:r>
+        <w:rPr>
+          <w:highlight w:val="yellow"/>
+        </w:rPr>
+        <w:t xml:space="preserve"> module from the </w:t>
+      </w:r>
+      <w:r>
+        <w:rPr>
+          <w:highlight w:val="yellow"/>
+        </w:rPr>
+        <w:t>PowerShell gallery</w:t>
+      </w:r>
+      <w:r>
+        <w:rPr>
+          <w:highlight w:val="yellow"/>
+        </w:rPr>
+        <w:t xml:space="preserve">. This module </w:t>
+      </w:r>
+      <w:r>
+        <w:rPr>
+          <w:highlight w:val="yellow"/>
+        </w:rPr>
+        <w:t xml:space="preserve">gives me command such as Import-Excel and Export-Excel that I use to read and write excel files. What I like about this module is that it does not need </w:t>
+      </w:r>
+      <w:r>
+        <w:rPr>
+          <w:highlight w:val="yellow"/>
+        </w:rPr>
+        <w:lastRenderedPageBreak/>
+        <w:t xml:space="preserve">Microsoft Excel. It reads and writes the excel file directly, so I can put it on a server without installing Microsoft Office there. I ran command Install-Module -Name </w:t>
+      </w:r>
+      <w:proofErr w:type="spellStart"/>
+      <w:r>
+        <w:rPr>
+          <w:highlight w:val="yellow"/>
+        </w:rPr>
+        <w:t>ImportExcel</w:t>
+      </w:r>
+      <w:proofErr w:type="spellEnd"/>
+      <w:r>
+        <w:rPr>
+          <w:highlight w:val="yellow"/>
+        </w:rPr>
+        <w:t xml:space="preserve"> and I didn’t get any red error, so it means this command worked.</w:t>
+      </w:r>
+      <w:r>
+        <w:t xml:space="preserve"> </w:t>
+      </w:r>
+    </w:p>
+    <w:p/>
+    <w:p>
+      <w:pPr>
         <w:rPr>
           <w:b/>
           <w:bCs/>
           <w:sz w:val="28"/>
           <w:szCs w:val="28"/>
         </w:rPr>
-        <w:t>Output:</w:t>
-      </w:r>
-      <w:r>
-        <w:t xml:space="preserve"> </w:t>
-      </w:r>
-      <w:r>
-        <w:rPr>
-          <w:highlight w:val="yellow"/>
-        </w:rPr>
-        <w:t>First,</w:t>
-      </w:r>
-      <w:r>
-        <w:rPr>
-          <w:highlight w:val="yellow"/>
-        </w:rPr>
-        <w:t xml:space="preserve"> I downloaded Fruits.xlsx from Slate and saved it in my Lab 4 folder.</w:t>
-      </w:r>
-      <w:r>
-        <w:rPr>
-          <w:rFonts w:ascii="Times New Roman" w:eastAsia="Times New Roman" w:hAnsi="Times New Roman" w:cs="Times New Roman"/>
-          <w:kern w:val="0"/>
-          <w:highlight w:val="yellow"/>
-          <w:lang w:eastAsia="en-CA"/>
-          <w14:ligatures w14:val="none"/>
-        </w:rPr>
-        <w:t xml:space="preserve"> </w:t>
-      </w:r>
-      <w:r>
-        <w:rPr>
-          <w:highlight w:val="yellow"/>
-        </w:rPr>
-        <w:t xml:space="preserve">Next, I created a </w:t>
-      </w:r>
-      <w:proofErr w:type="spellStart"/>
-      <w:r>
-        <w:rPr>
-          <w:highlight w:val="yellow"/>
-        </w:rPr>
-        <w:t>hashtable</w:t>
-      </w:r>
-      <w:proofErr w:type="spellEnd"/>
-      <w:r>
-        <w:rPr>
-          <w:highlight w:val="yellow"/>
-        </w:rPr>
-        <w:t xml:space="preserve"> called $</w:t>
-      </w:r>
-      <w:proofErr w:type="spellStart"/>
-      <w:r>
-        <w:rPr>
-          <w:highlight w:val="yellow"/>
-        </w:rPr>
-        <w:t>copyParams</w:t>
-      </w:r>
-      <w:proofErr w:type="spellEnd"/>
-      <w:r>
-        <w:rPr>
-          <w:highlight w:val="yellow"/>
-        </w:rPr>
-        <w:t xml:space="preserve"> to store the information </w:t>
-      </w:r>
-      <w:r>
-        <w:rPr>
-          <w:highlight w:val="yellow"/>
-        </w:rPr>
-        <w:t>which needed</w:t>
-      </w:r>
-      <w:r>
-        <w:rPr>
-          <w:highlight w:val="yellow"/>
-        </w:rPr>
-        <w:t xml:space="preserve"> to copy the file. Path is the file's current location, Destination is where I want to save it on the server, and </w:t>
-      </w:r>
-      <w:proofErr w:type="spellStart"/>
-      <w:r>
-        <w:rPr>
-          <w:highlight w:val="yellow"/>
-        </w:rPr>
-        <w:t>ToSession</w:t>
-      </w:r>
-      <w:proofErr w:type="spellEnd"/>
-      <w:r>
-        <w:rPr>
-          <w:highlight w:val="yellow"/>
-        </w:rPr>
-        <w:t xml:space="preserve"> tells PowerShell which remote session to use</w:t>
-      </w:r>
-      <w:r>
-        <w:rPr>
-          <w:highlight w:val="yellow"/>
-        </w:rPr>
-        <w:t>.</w:t>
-      </w:r>
-      <w:r>
-        <w:rPr>
-          <w:rFonts w:ascii="Times New Roman" w:eastAsia="Times New Roman" w:hAnsi="Times New Roman" w:cs="Times New Roman"/>
-          <w:kern w:val="0"/>
-          <w:highlight w:val="yellow"/>
-          <w:lang w:eastAsia="en-CA"/>
-          <w14:ligatures w14:val="none"/>
-        </w:rPr>
-        <w:t xml:space="preserve"> </w:t>
-      </w:r>
-      <w:r>
-        <w:rPr>
-          <w:highlight w:val="yellow"/>
-        </w:rPr>
-        <w:t xml:space="preserve">The command Copy-Item @copyParams copies the file to the server. The @ symbol allows PowerShell to use the values in the </w:t>
-      </w:r>
-      <w:proofErr w:type="spellStart"/>
-      <w:r>
-        <w:rPr>
-          <w:highlight w:val="yellow"/>
-        </w:rPr>
-        <w:t>hashtable</w:t>
-      </w:r>
-      <w:proofErr w:type="spellEnd"/>
-      <w:r>
-        <w:rPr>
-          <w:highlight w:val="yellow"/>
-        </w:rPr>
-        <w:t xml:space="preserve"> as command </w:t>
-      </w:r>
-      <w:r>
-        <w:rPr>
-          <w:highlight w:val="yellow"/>
-        </w:rPr>
-        <w:t xml:space="preserve">parameters. Then, </w:t>
-      </w:r>
-      <w:r>
-        <w:rPr>
-          <w:highlight w:val="yellow"/>
-        </w:rPr>
-        <w:t>I save the session in a variable</w:t>
-      </w:r>
-      <w:r>
-        <w:rPr>
-          <w:highlight w:val="yellow"/>
-        </w:rPr>
-        <w:t xml:space="preserve"> and </w:t>
-      </w:r>
-      <w:proofErr w:type="gramStart"/>
-      <w:r>
-        <w:rPr>
-          <w:highlight w:val="yellow"/>
-        </w:rPr>
-        <w:t>To</w:t>
-      </w:r>
-      <w:proofErr w:type="gramEnd"/>
-      <w:r>
-        <w:rPr>
-          <w:highlight w:val="yellow"/>
-        </w:rPr>
-        <w:t xml:space="preserve"> check the result, I enter $session and look for State: Opened. Then Invoke-Command runs Test-Path on the server to check whether the file exists. A result of True means the file was found at the specified location</w:t>
-      </w:r>
-      <w:r>
-        <w:t>.</w:t>
-      </w:r>
-    </w:p>
-    <w:p>
-      <w:pPr>
-        <w:spacing w:after="120" w:line="276" w:lineRule="auto"/>
-      </w:pPr>
-    </w:p>
-    <w:p>
-      <w:pPr>
-        <w:spacing w:after="120" w:line="276" w:lineRule="auto"/>
-        <w:rPr>
-          <w:b/>
-          <w:bCs/>
-        </w:rPr>
-      </w:pPr>
-      <w:r>
-        <w:rPr>
-          <w:b/>
-          <w:bCs/>
-        </w:rPr>
-        <w:t>Step 3: Log In to the Server</w:t>
-      </w:r>
-      <w:r>
-        <w:rPr>
-          <w:b/>
-          <w:bCs/>
-        </w:rPr>
-        <w:t xml:space="preserve"> </w:t>
-      </w:r>
-    </w:p>
-    <w:p>
-      <w:pPr>
-        <w:spacing w:after="120" w:line="276" w:lineRule="auto"/>
-        <w:rPr>
-          <w:b/>
-          <w:bCs/>
-        </w:rPr>
-      </w:pPr>
-      <w:r>
-        <w:rPr>
-          <w:b/>
-          <w:bCs/>
-        </w:rPr>
-        <w:lastRenderedPageBreak/>
+      </w:pPr>
+      <w:r>
+        <w:rPr>
+          <w:b/>
+          <w:bCs/>
+          <w:sz w:val="28"/>
+          <w:szCs w:val="28"/>
+        </w:rPr>
+        <w:t>Step 2: Copy Fruits .xlsx to the server</w:t>
+      </w:r>
+    </w:p>
+    <w:p>
+      <w:r>
+        <w:rPr>
+          <w:noProof/>
+        </w:rPr>
         <w:drawing>
-          <wp:inline distT="0" distB="0" distL="0" distR="0" wp14:anchorId="048C5B5B" wp14:editId="6F58C7B5">
+          <wp:inline distT="0" distB="0" distL="0" distR="0" wp14:anchorId="4337B1D3" wp14:editId="0F9FF2CA">
             <wp:extent cx="5943600" cy="3714750"/>
             <wp:effectExtent l="0" t="0" r="0" b="0"/>
-            <wp:docPr id="124335091" name="Picture 1"/>
+            <wp:docPr id="1109721744" name="Picture 1"/>
             <wp:cNvGraphicFramePr>
               <a:graphicFrameLocks xmlns:a="http://schemas.openxmlformats.org/drawingml/2006/main" noChangeAspect="1"/>
             </wp:cNvGraphicFramePr>
@@ -609,7 +333,7 @@
               <a:graphicData uri="http://schemas.openxmlformats.org/drawingml/2006/picture">
                 <pic:pic xmlns:pic="http://schemas.openxmlformats.org/drawingml/2006/picture">
                   <pic:nvPicPr>
-                    <pic:cNvPr id="124335091" name=""/>
+                    <pic:cNvPr id="1109721744" name=""/>
                     <pic:cNvPicPr/>
                   </pic:nvPicPr>
                   <pic:blipFill>
@@ -642,86 +366,174 @@
         <w:rPr>
           <w:b/>
           <w:bCs/>
-        </w:rPr>
-        <w:t>Output</w:t>
-      </w:r>
-      <w:r>
-        <w:rPr>
-          <w:highlight w:val="yellow"/>
-        </w:rPr>
-        <w:t xml:space="preserve">: </w:t>
-      </w:r>
-      <w:r>
-        <w:rPr>
-          <w:highlight w:val="yellow"/>
-        </w:rPr>
-        <w:t xml:space="preserve">This </w:t>
-      </w:r>
-      <w:r>
-        <w:rPr>
-          <w:highlight w:val="yellow"/>
-        </w:rPr>
-        <w:t xml:space="preserve">Command </w:t>
-      </w:r>
-      <w:r>
-        <w:rPr>
-          <w:highlight w:val="yellow"/>
-        </w:rPr>
-        <w:t xml:space="preserve">tells me that I am working on the remote server. I </w:t>
-      </w:r>
-      <w:r>
-        <w:rPr>
-          <w:highlight w:val="yellow"/>
-        </w:rPr>
-        <w:t xml:space="preserve">am successfully </w:t>
-      </w:r>
-      <w:r>
-        <w:rPr>
-          <w:highlight w:val="yellow"/>
-        </w:rPr>
-        <w:t>connected to the server for the next steps of the lab.</w:t>
-      </w:r>
-    </w:p>
-    <w:p>
-      <w:pPr>
-        <w:spacing w:after="120" w:line="276" w:lineRule="auto"/>
-      </w:pPr>
-    </w:p>
-    <w:p>
-      <w:pPr>
-        <w:spacing w:after="120" w:line="276" w:lineRule="auto"/>
-        <w:rPr>
-          <w:b/>
-          <w:bCs/>
-        </w:rPr>
-      </w:pPr>
-      <w:r>
-        <w:rPr>
-          <w:b/>
-          <w:bCs/>
-        </w:rPr>
-        <w:t>Step 4: Import Data from Excel</w:t>
-      </w:r>
-    </w:p>
-    <w:p>
-      <w:pPr>
-        <w:spacing w:after="120" w:line="276" w:lineRule="auto"/>
-        <w:rPr>
-          <w:b/>
-          <w:bCs/>
-        </w:rPr>
-      </w:pPr>
-      <w:r>
-        <w:rPr>
-          <w:b/>
-          <w:bCs/>
+          <w:sz w:val="28"/>
+          <w:szCs w:val="28"/>
+        </w:rPr>
+        <w:t>Output:</w:t>
+      </w:r>
+      <w:r>
+        <w:t xml:space="preserve"> </w:t>
+      </w:r>
+      <w:r>
+        <w:rPr>
+          <w:highlight w:val="yellow"/>
+        </w:rPr>
+        <w:t>First, I downloaded Fruits.xlsx from Slate and saved it in my Lab 4 folder.</w:t>
+      </w:r>
+      <w:r>
+        <w:rPr>
+          <w:rFonts w:ascii="Times New Roman" w:eastAsia="Times New Roman" w:hAnsi="Times New Roman" w:cs="Times New Roman"/>
+          <w:kern w:val="0"/>
+          <w:highlight w:val="yellow"/>
+          <w:lang w:eastAsia="en-CA"/>
+          <w14:ligatures w14:val="none"/>
+        </w:rPr>
+        <w:t xml:space="preserve"> </w:t>
+      </w:r>
+      <w:r>
+        <w:rPr>
+          <w:highlight w:val="yellow"/>
+        </w:rPr>
+        <w:t xml:space="preserve">Next, I created a </w:t>
+      </w:r>
+      <w:proofErr w:type="spellStart"/>
+      <w:r>
+        <w:rPr>
+          <w:highlight w:val="yellow"/>
+        </w:rPr>
+        <w:t>hashtable</w:t>
+      </w:r>
+      <w:proofErr w:type="spellEnd"/>
+      <w:r>
+        <w:rPr>
+          <w:highlight w:val="yellow"/>
+        </w:rPr>
+        <w:t xml:space="preserve"> called $</w:t>
+      </w:r>
+      <w:proofErr w:type="spellStart"/>
+      <w:r>
+        <w:rPr>
+          <w:highlight w:val="yellow"/>
+        </w:rPr>
+        <w:t>copyParams</w:t>
+      </w:r>
+      <w:proofErr w:type="spellEnd"/>
+      <w:r>
+        <w:rPr>
+          <w:highlight w:val="yellow"/>
+        </w:rPr>
+        <w:t xml:space="preserve"> to store the information which needed to copy the file. Path is the file's current location, Destination is where I want to save it on the server, and </w:t>
+      </w:r>
+      <w:proofErr w:type="spellStart"/>
+      <w:r>
+        <w:rPr>
+          <w:highlight w:val="yellow"/>
+        </w:rPr>
+        <w:t>ToSession</w:t>
+      </w:r>
+      <w:proofErr w:type="spellEnd"/>
+      <w:r>
+        <w:rPr>
+          <w:highlight w:val="yellow"/>
+        </w:rPr>
+        <w:t xml:space="preserve"> tells PowerShell which remote session to use.</w:t>
+      </w:r>
+      <w:r>
+        <w:rPr>
+          <w:rFonts w:ascii="Times New Roman" w:eastAsia="Times New Roman" w:hAnsi="Times New Roman" w:cs="Times New Roman"/>
+          <w:kern w:val="0"/>
+          <w:highlight w:val="yellow"/>
+          <w:lang w:eastAsia="en-CA"/>
+          <w14:ligatures w14:val="none"/>
+        </w:rPr>
+        <w:t xml:space="preserve"> </w:t>
+      </w:r>
+      <w:r>
+        <w:rPr>
+          <w:highlight w:val="yellow"/>
+        </w:rPr>
+        <w:t xml:space="preserve">The command Copy-Item @copyParams copies the file to the server. The @ symbol allows PowerShell to use the values in the </w:t>
+      </w:r>
+      <w:proofErr w:type="spellStart"/>
+      <w:r>
+        <w:rPr>
+          <w:highlight w:val="yellow"/>
+        </w:rPr>
+        <w:t>hashtable</w:t>
+      </w:r>
+      <w:proofErr w:type="spellEnd"/>
+      <w:r>
+        <w:rPr>
+          <w:highlight w:val="yellow"/>
+        </w:rPr>
+        <w:t xml:space="preserve"> as command parameters. Then, I save the session in a variable and </w:t>
+      </w:r>
+      <w:proofErr w:type="gramStart"/>
+      <w:r>
+        <w:rPr>
+          <w:highlight w:val="yellow"/>
+        </w:rPr>
+        <w:t>To</w:t>
+      </w:r>
+      <w:proofErr w:type="gramEnd"/>
+      <w:r>
+        <w:rPr>
+          <w:highlight w:val="yellow"/>
+        </w:rPr>
+        <w:t xml:space="preserve"> check the result, I enter $session and look for State: Opened. Then Invoke-Command runs Test-Path on the server to check whether the file exists. A result of True means the file was found at the specified location</w:t>
+      </w:r>
+      <w:r>
+        <w:t>.</w:t>
+      </w:r>
+    </w:p>
+    <w:p>
+      <w:pPr>
+        <w:spacing w:after="120" w:line="276" w:lineRule="auto"/>
+      </w:pPr>
+    </w:p>
+    <w:p>
+      <w:pPr>
+        <w:spacing w:after="120" w:line="276" w:lineRule="auto"/>
+        <w:rPr>
+          <w:b/>
+          <w:bCs/>
+        </w:rPr>
+      </w:pPr>
+      <w:r>
+        <w:rPr>
+          <w:b/>
+          <w:bCs/>
+        </w:rPr>
+        <w:t>Step 3: Log In to the Server</w:t>
+      </w:r>
+      <w:r>
+        <w:rPr>
+          <w:b/>
+          <w:bCs/>
+        </w:rPr>
+        <w:t xml:space="preserve"> </w:t>
+      </w:r>
+    </w:p>
+    <w:p>
+      <w:pPr>
+        <w:spacing w:after="120" w:line="276" w:lineRule="auto"/>
+        <w:rPr>
+          <w:b/>
+          <w:bCs/>
+        </w:rPr>
+      </w:pPr>
+      <w:r>
+        <w:rPr>
+          <w:b/>
+          <w:bCs/>
+          <w:noProof/>
         </w:rPr>
         <w:lastRenderedPageBreak/>
         <w:drawing>
-          <wp:inline distT="0" distB="0" distL="0" distR="0" wp14:anchorId="6470E788" wp14:editId="7929846C">
+          <wp:inline distT="0" distB="0" distL="0" distR="0" wp14:anchorId="048C5B5B" wp14:editId="6F58C7B5">
             <wp:extent cx="5943600" cy="3714750"/>
             <wp:effectExtent l="0" t="0" r="0" b="0"/>
-            <wp:docPr id="53969343" name="Picture 1"/>
+            <wp:docPr id="124335091" name="Picture 1"/>
             <wp:cNvGraphicFramePr>
               <a:graphicFrameLocks xmlns:a="http://schemas.openxmlformats.org/drawingml/2006/main" noChangeAspect="1"/>
             </wp:cNvGraphicFramePr>
@@ -729,7 +541,7 @@
               <a:graphicData uri="http://schemas.openxmlformats.org/drawingml/2006/picture">
                 <pic:pic xmlns:pic="http://schemas.openxmlformats.org/drawingml/2006/picture">
                   <pic:nvPicPr>
-                    <pic:cNvPr id="53969343" name=""/>
+                    <pic:cNvPr id="124335091" name=""/>
                     <pic:cNvPicPr/>
                   </pic:nvPicPr>
                   <pic:blipFill>
@@ -763,213 +575,56 @@
           <w:b/>
           <w:bCs/>
         </w:rPr>
-        <w:t xml:space="preserve">Output: </w:t>
-      </w:r>
-      <w:r>
-        <w:rPr>
-          <w:highlight w:val="yellow"/>
-        </w:rPr>
-        <w:t>Import-Excel reads the data from Fruits.xlsx and brings it into PowerShell. I used -</w:t>
-      </w:r>
-      <w:proofErr w:type="spellStart"/>
-      <w:r>
-        <w:rPr>
-          <w:highlight w:val="yellow"/>
-        </w:rPr>
-        <w:t>OutVariable</w:t>
-      </w:r>
-      <w:proofErr w:type="spellEnd"/>
-      <w:r>
-        <w:rPr>
-          <w:highlight w:val="yellow"/>
-        </w:rPr>
-        <w:t xml:space="preserve"> fruit so the imported data is also saved in a variable called $</w:t>
-      </w:r>
-      <w:r>
-        <w:rPr>
-          <w:highlight w:val="yellow"/>
-        </w:rPr>
-        <w:t>fruit</w:t>
-      </w:r>
-      <w:r>
-        <w:rPr>
-          <w:b/>
-          <w:bCs/>
-          <w:highlight w:val="yellow"/>
-        </w:rPr>
-        <w:t>.</w:t>
-      </w:r>
-      <w:r>
-        <w:rPr>
-          <w:highlight w:val="yellow"/>
-        </w:rPr>
-        <w:t xml:space="preserve"> Get</w:t>
-      </w:r>
-      <w:r>
-        <w:rPr>
-          <w:highlight w:val="yellow"/>
-        </w:rPr>
-        <w:t>-Member shows the type of data stored in the variable and the properties it contains. This helps me understand what information is available in the imported data</w:t>
-      </w:r>
-      <w:r>
-        <w:rPr>
-          <w:b/>
-          <w:bCs/>
-          <w:highlight w:val="yellow"/>
-        </w:rPr>
-        <w:t>.</w:t>
-      </w:r>
-      <w:r>
-        <w:rPr>
-          <w:rFonts w:ascii="Geist Fallback" w:hAnsi="Geist Fallback"/>
-          <w:sz w:val="23"/>
-          <w:szCs w:val="23"/>
-          <w:highlight w:val="yellow"/>
-        </w:rPr>
-        <w:t xml:space="preserve"> </w:t>
-      </w:r>
-      <w:r>
-        <w:rPr>
-          <w:highlight w:val="yellow"/>
-        </w:rPr>
-        <w:t>The first command will print the fruit data from the spreadsheet as well as the names of the rows and columns. The column names will be required later when creating the chart. The Get-Member output shows that each row is a</w:t>
-      </w:r>
-      <w:r>
-        <w:rPr>
-          <w:highlight w:val="yellow"/>
-        </w:rPr>
-        <w:t xml:space="preserve"> TypeName: </w:t>
-      </w:r>
-      <w:proofErr w:type="spellStart"/>
-      <w:proofErr w:type="gramStart"/>
-      <w:r>
-        <w:rPr>
-          <w:highlight w:val="yellow"/>
-        </w:rPr>
-        <w:t>System.Management.Automation.PSCustomObject</w:t>
-      </w:r>
-      <w:proofErr w:type="spellEnd"/>
-      <w:proofErr w:type="gramEnd"/>
-      <w:r>
-        <w:rPr>
-          <w:highlight w:val="yellow"/>
-        </w:rPr>
-        <w:t xml:space="preserve">. </w:t>
-      </w:r>
-      <w:r>
-        <w:rPr>
-          <w:highlight w:val="yellow"/>
-        </w:rPr>
-        <w:t xml:space="preserve">It also displays two </w:t>
-      </w:r>
-      <w:proofErr w:type="spellStart"/>
-      <w:r>
-        <w:rPr>
-          <w:highlight w:val="yellow"/>
-        </w:rPr>
-        <w:t>NoteProperty</w:t>
-      </w:r>
-      <w:proofErr w:type="spellEnd"/>
-      <w:r>
-        <w:rPr>
-          <w:highlight w:val="yellow"/>
-        </w:rPr>
-        <w:t xml:space="preserve"> entries, these being the two columns of the spreadsheet. The other entries (Equals, </w:t>
-      </w:r>
-      <w:proofErr w:type="spellStart"/>
-      <w:r>
-        <w:rPr>
-          <w:highlight w:val="yellow"/>
-        </w:rPr>
-        <w:t>GetHashCode</w:t>
-      </w:r>
-      <w:proofErr w:type="spellEnd"/>
-      <w:r>
-        <w:rPr>
-          <w:highlight w:val="yellow"/>
-        </w:rPr>
-        <w:t xml:space="preserve">, </w:t>
-      </w:r>
-      <w:proofErr w:type="spellStart"/>
-      <w:r>
-        <w:rPr>
-          <w:highlight w:val="yellow"/>
-        </w:rPr>
-        <w:t>GetType</w:t>
-      </w:r>
-      <w:proofErr w:type="spellEnd"/>
-      <w:r>
-        <w:rPr>
-          <w:highlight w:val="yellow"/>
-        </w:rPr>
-        <w:t xml:space="preserve">, </w:t>
-      </w:r>
-      <w:proofErr w:type="spellStart"/>
-      <w:r>
-        <w:rPr>
-          <w:highlight w:val="yellow"/>
-        </w:rPr>
-        <w:t>ToString</w:t>
-      </w:r>
-      <w:proofErr w:type="spellEnd"/>
-      <w:r>
-        <w:rPr>
-          <w:highlight w:val="yellow"/>
-        </w:rPr>
-        <w:t>) are common object methods.</w:t>
-      </w:r>
-    </w:p>
-    <w:p>
-      <w:pPr>
-        <w:spacing w:after="120" w:line="276" w:lineRule="auto"/>
-        <w:rPr>
-          <w:b/>
-          <w:bCs/>
-        </w:rPr>
-      </w:pPr>
-    </w:p>
-    <w:p>
-      <w:pPr>
-        <w:spacing w:after="120" w:line="276" w:lineRule="auto"/>
-        <w:rPr>
-          <w:b/>
-          <w:bCs/>
-        </w:rPr>
-      </w:pPr>
-      <w:r>
-        <w:rPr>
-          <w:b/>
-          <w:bCs/>
-        </w:rPr>
-        <w:t xml:space="preserve">Step 5: </w:t>
-      </w:r>
-      <w:r>
-        <w:rPr>
-          <w:b/>
-          <w:bCs/>
-        </w:rPr>
-        <w:t>Export Data to Excel</w:t>
-      </w:r>
-    </w:p>
-    <w:p>
-      <w:pPr>
-        <w:spacing w:after="120" w:line="276" w:lineRule="auto"/>
-        <w:rPr>
-          <w:b/>
-          <w:bCs/>
-        </w:rPr>
-      </w:pPr>
-      <w:r>
-        <w:rPr>
-          <w:b/>
-          <w:bCs/>
+        <w:t>Output</w:t>
+      </w:r>
+      <w:r>
+        <w:rPr>
+          <w:highlight w:val="yellow"/>
+        </w:rPr>
+        <w:t>: This Command tells me that I am working on the remote server. I am successfully connected to the server for the next steps of the lab.</w:t>
+      </w:r>
+    </w:p>
+    <w:p>
+      <w:pPr>
+        <w:spacing w:after="120" w:line="276" w:lineRule="auto"/>
+      </w:pPr>
+    </w:p>
+    <w:p>
+      <w:pPr>
+        <w:spacing w:after="120" w:line="276" w:lineRule="auto"/>
+        <w:rPr>
+          <w:b/>
+          <w:bCs/>
+        </w:rPr>
+      </w:pPr>
+      <w:r>
+        <w:rPr>
+          <w:b/>
+          <w:bCs/>
+        </w:rPr>
+        <w:t>Step 4: Import Data from Excel</w:t>
+      </w:r>
+    </w:p>
+    <w:p>
+      <w:pPr>
+        <w:spacing w:after="120" w:line="276" w:lineRule="auto"/>
+        <w:rPr>
+          <w:b/>
+          <w:bCs/>
+        </w:rPr>
+      </w:pPr>
+      <w:r>
+        <w:rPr>
+          <w:b/>
+          <w:bCs/>
+          <w:noProof/>
         </w:rPr>
         <w:lastRenderedPageBreak/>
         <w:drawing>
-          <wp:inline distT="0" distB="0" distL="0" distR="0" wp14:anchorId="74FE1817" wp14:editId="6BD1599E">
+          <wp:inline distT="0" distB="0" distL="0" distR="0" wp14:anchorId="6470E788" wp14:editId="7929846C">
             <wp:extent cx="5943600" cy="3714750"/>
             <wp:effectExtent l="0" t="0" r="0" b="0"/>
-            <wp:docPr id="2020293359" name="Picture 1"/>
+            <wp:docPr id="53969343" name="Picture 1"/>
             <wp:cNvGraphicFramePr>
               <a:graphicFrameLocks xmlns:a="http://schemas.openxmlformats.org/drawingml/2006/main" noChangeAspect="1"/>
             </wp:cNvGraphicFramePr>
@@ -977,7 +632,7 @@
               <a:graphicData uri="http://schemas.openxmlformats.org/drawingml/2006/picture">
                 <pic:pic xmlns:pic="http://schemas.openxmlformats.org/drawingml/2006/picture">
                   <pic:nvPicPr>
-                    <pic:cNvPr id="2020293359" name=""/>
+                    <pic:cNvPr id="53969343" name=""/>
                     <pic:cNvPicPr/>
                   </pic:nvPicPr>
                   <pic:blipFill>
@@ -1005,9 +660,6 @@
     <w:p>
       <w:pPr>
         <w:spacing w:after="120" w:line="276" w:lineRule="auto"/>
-        <w:rPr>
-          <w:highlight w:val="yellow"/>
-        </w:rPr>
       </w:pPr>
       <w:r>
         <w:rPr>
@@ -1020,6 +672,234 @@
         <w:rPr>
           <w:highlight w:val="yellow"/>
         </w:rPr>
+        <w:t>Import-Excel reads the data from Fruits.xlsx and brings it into PowerShell. I used -</w:t>
+      </w:r>
+      <w:proofErr w:type="spellStart"/>
+      <w:r>
+        <w:rPr>
+          <w:highlight w:val="yellow"/>
+        </w:rPr>
+        <w:t>OutVariable</w:t>
+      </w:r>
+      <w:proofErr w:type="spellEnd"/>
+      <w:r>
+        <w:rPr>
+          <w:highlight w:val="yellow"/>
+        </w:rPr>
+        <w:t xml:space="preserve"> fruit so the imported data is also saved in a variable called $fruit</w:t>
+      </w:r>
+      <w:r>
+        <w:rPr>
+          <w:b/>
+          <w:bCs/>
+          <w:highlight w:val="yellow"/>
+        </w:rPr>
+        <w:t>.</w:t>
+      </w:r>
+      <w:r>
+        <w:rPr>
+          <w:highlight w:val="yellow"/>
+        </w:rPr>
+        <w:t xml:space="preserve"> Get-Member shows the type of data stored in the variable and the properties it contains. This helps me understand what information is available in the imported data</w:t>
+      </w:r>
+      <w:r>
+        <w:rPr>
+          <w:b/>
+          <w:bCs/>
+          <w:highlight w:val="yellow"/>
+        </w:rPr>
+        <w:t>.</w:t>
+      </w:r>
+      <w:r>
+        <w:rPr>
+          <w:rFonts w:ascii="Geist Fallback" w:hAnsi="Geist Fallback"/>
+          <w:sz w:val="23"/>
+          <w:szCs w:val="23"/>
+          <w:highlight w:val="yellow"/>
+        </w:rPr>
+        <w:t xml:space="preserve"> </w:t>
+      </w:r>
+      <w:r>
+        <w:rPr>
+          <w:highlight w:val="yellow"/>
+        </w:rPr>
+        <w:t xml:space="preserve">The first command will print the fruit data from the spreadsheet as well as the names of the rows and columns. The column names will be required later when creating the chart. The Get-Member output shows that each row is a TypeName: </w:t>
+      </w:r>
+      <w:proofErr w:type="spellStart"/>
+      <w:proofErr w:type="gramStart"/>
+      <w:r>
+        <w:rPr>
+          <w:highlight w:val="yellow"/>
+        </w:rPr>
+        <w:t>System.Management.Automation.PSCustomObject</w:t>
+      </w:r>
+      <w:proofErr w:type="spellEnd"/>
+      <w:proofErr w:type="gramEnd"/>
+      <w:r>
+        <w:rPr>
+          <w:highlight w:val="yellow"/>
+        </w:rPr>
+        <w:t xml:space="preserve">. It also displays two </w:t>
+      </w:r>
+      <w:proofErr w:type="spellStart"/>
+      <w:r>
+        <w:rPr>
+          <w:highlight w:val="yellow"/>
+        </w:rPr>
+        <w:t>NoteProperty</w:t>
+      </w:r>
+      <w:proofErr w:type="spellEnd"/>
+      <w:r>
+        <w:rPr>
+          <w:highlight w:val="yellow"/>
+        </w:rPr>
+        <w:t xml:space="preserve"> entries, these being the two columns of the spreadsheet. The other entries (Equals, </w:t>
+      </w:r>
+      <w:proofErr w:type="spellStart"/>
+      <w:r>
+        <w:rPr>
+          <w:highlight w:val="yellow"/>
+        </w:rPr>
+        <w:t>GetHashCode</w:t>
+      </w:r>
+      <w:proofErr w:type="spellEnd"/>
+      <w:r>
+        <w:rPr>
+          <w:highlight w:val="yellow"/>
+        </w:rPr>
+        <w:t xml:space="preserve">, </w:t>
+      </w:r>
+      <w:proofErr w:type="spellStart"/>
+      <w:r>
+        <w:rPr>
+          <w:highlight w:val="yellow"/>
+        </w:rPr>
+        <w:t>GetType</w:t>
+      </w:r>
+      <w:proofErr w:type="spellEnd"/>
+      <w:r>
+        <w:rPr>
+          <w:highlight w:val="yellow"/>
+        </w:rPr>
+        <w:t xml:space="preserve">, </w:t>
+      </w:r>
+      <w:proofErr w:type="spellStart"/>
+      <w:r>
+        <w:rPr>
+          <w:highlight w:val="yellow"/>
+        </w:rPr>
+        <w:t>ToString</w:t>
+      </w:r>
+      <w:proofErr w:type="spellEnd"/>
+      <w:r>
+        <w:rPr>
+          <w:highlight w:val="yellow"/>
+        </w:rPr>
+        <w:t>) are common object methods.</w:t>
+      </w:r>
+    </w:p>
+    <w:p>
+      <w:pPr>
+        <w:spacing w:after="120" w:line="276" w:lineRule="auto"/>
+        <w:rPr>
+          <w:b/>
+          <w:bCs/>
+        </w:rPr>
+      </w:pPr>
+    </w:p>
+    <w:p>
+      <w:pPr>
+        <w:spacing w:after="120" w:line="276" w:lineRule="auto"/>
+        <w:rPr>
+          <w:b/>
+          <w:bCs/>
+        </w:rPr>
+      </w:pPr>
+      <w:r>
+        <w:rPr>
+          <w:b/>
+          <w:bCs/>
+        </w:rPr>
+        <w:t xml:space="preserve">Step 5: </w:t>
+      </w:r>
+      <w:r>
+        <w:rPr>
+          <w:b/>
+          <w:bCs/>
+        </w:rPr>
+        <w:t>Export Data to Excel</w:t>
+      </w:r>
+    </w:p>
+    <w:p>
+      <w:pPr>
+        <w:spacing w:after="120" w:line="276" w:lineRule="auto"/>
+        <w:rPr>
+          <w:b/>
+          <w:bCs/>
+        </w:rPr>
+      </w:pPr>
+      <w:r>
+        <w:rPr>
+          <w:b/>
+          <w:bCs/>
+          <w:noProof/>
+        </w:rPr>
+        <w:lastRenderedPageBreak/>
+        <w:drawing>
+          <wp:inline distT="0" distB="0" distL="0" distR="0" wp14:anchorId="74FE1817" wp14:editId="6BD1599E">
+            <wp:extent cx="5943600" cy="3714750"/>
+            <wp:effectExtent l="0" t="0" r="0" b="0"/>
+            <wp:docPr id="2020293359" name="Picture 1"/>
+            <wp:cNvGraphicFramePr>
+              <a:graphicFrameLocks xmlns:a="http://schemas.openxmlformats.org/drawingml/2006/main" noChangeAspect="1"/>
+            </wp:cNvGraphicFramePr>
+            <a:graphic xmlns:a="http://schemas.openxmlformats.org/drawingml/2006/main">
+              <a:graphicData uri="http://schemas.openxmlformats.org/drawingml/2006/picture">
+                <pic:pic xmlns:pic="http://schemas.openxmlformats.org/drawingml/2006/picture">
+                  <pic:nvPicPr>
+                    <pic:cNvPr id="2020293359" name=""/>
+                    <pic:cNvPicPr/>
+                  </pic:nvPicPr>
+                  <pic:blipFill>
+                    <a:blip r:embed="rId9"/>
+                    <a:stretch>
+                      <a:fillRect/>
+                    </a:stretch>
+                  </pic:blipFill>
+                  <pic:spPr>
+                    <a:xfrm>
+                      <a:off x="0" y="0"/>
+                      <a:ext cx="5943600" cy="3714750"/>
+                    </a:xfrm>
+                    <a:prstGeom prst="rect">
+                      <a:avLst/>
+                    </a:prstGeom>
+                  </pic:spPr>
+                </pic:pic>
+              </a:graphicData>
+            </a:graphic>
+          </wp:inline>
+        </w:drawing>
+      </w:r>
+    </w:p>
+    <w:p>
+      <w:pPr>
+        <w:spacing w:after="120" w:line="276" w:lineRule="auto"/>
+        <w:rPr>
+          <w:highlight w:val="yellow"/>
+        </w:rPr>
+      </w:pPr>
+      <w:r>
+        <w:rPr>
+          <w:b/>
+          <w:bCs/>
+        </w:rPr>
+        <w:t xml:space="preserve">Output: </w:t>
+      </w:r>
+      <w:r>
+        <w:rPr>
+          <w:highlight w:val="yellow"/>
+        </w:rPr>
         <w:t xml:space="preserve">I wanted to export a larger amount of data, so I used Get-Process to collect information about the processes running on the server. The pipe symbol (|) sends this information to Export-Excel, which saves it in a new Excel file called </w:t>
       </w:r>
       <w:proofErr w:type="spellStart"/>
@@ -1089,6 +969,9 @@
         <w:spacing w:after="120" w:line="276" w:lineRule="auto"/>
       </w:pPr>
       <w:r>
+        <w:rPr>
+          <w:noProof/>
+        </w:rPr>
         <w:lastRenderedPageBreak/>
         <w:drawing>
           <wp:inline distT="0" distB="0" distL="0" distR="0" wp14:anchorId="57364812" wp14:editId="233AF4F1">
@@ -1106,7 +989,7 @@
                     <pic:cNvPicPr/>
                   </pic:nvPicPr>
                   <pic:blipFill>
-                    <a:blip r:embed="rId9"/>
+                    <a:blip r:embed="rId10"/>
                     <a:stretch>
                       <a:fillRect/>
                     </a:stretch>
@@ -1259,6 +1142,7 @@
         <w:rPr>
           <w:b/>
           <w:bCs/>
+          <w:noProof/>
         </w:rPr>
         <w:lastRenderedPageBreak/>
         <w:drawing>
@@ -1274,156 +1158,6 @@
                 <pic:pic xmlns:pic="http://schemas.openxmlformats.org/drawingml/2006/picture">
                   <pic:nvPicPr>
                     <pic:cNvPr id="1199938041" name=""/>
-                    <pic:cNvPicPr/>
-                  </pic:nvPicPr>
-                  <pic:blipFill>
-                    <a:blip r:embed="rId10"/>
-                    <a:stretch>
-                      <a:fillRect/>
-                    </a:stretch>
-                  </pic:blipFill>
-                  <pic:spPr>
-                    <a:xfrm>
-                      <a:off x="0" y="0"/>
-                      <a:ext cx="5943600" cy="3714750"/>
-                    </a:xfrm>
-                    <a:prstGeom prst="rect">
-                      <a:avLst/>
-                    </a:prstGeom>
-                  </pic:spPr>
-                </pic:pic>
-              </a:graphicData>
-            </a:graphic>
-          </wp:inline>
-        </w:drawing>
-      </w:r>
-    </w:p>
-    <w:p>
-      <w:pPr>
-        <w:spacing w:after="120" w:line="276" w:lineRule="auto"/>
-      </w:pPr>
-      <w:r>
-        <w:rPr>
-          <w:b/>
-          <w:bCs/>
-        </w:rPr>
-        <w:t xml:space="preserve">Output: </w:t>
-      </w:r>
-      <w:r>
-        <w:rPr>
-          <w:highlight w:val="yellow"/>
-        </w:rPr>
-        <w:t>My first step was to make a little table with four people and their cities. The [</w:t>
-      </w:r>
-      <w:proofErr w:type="spellStart"/>
-      <w:r>
-        <w:rPr>
-          <w:highlight w:val="yellow"/>
-        </w:rPr>
-        <w:t>PSCustomObject</w:t>
-      </w:r>
-      <w:proofErr w:type="spellEnd"/>
-      <w:r>
-        <w:rPr>
-          <w:highlight w:val="yellow"/>
-        </w:rPr>
-        <w:t xml:space="preserve">] block represents one object, each containing a Name and City. The </w:t>
-      </w:r>
-      <w:proofErr w:type="gramStart"/>
-      <w:r>
-        <w:rPr>
-          <w:highlight w:val="yellow"/>
-        </w:rPr>
-        <w:t>@(</w:t>
-      </w:r>
-      <w:proofErr w:type="gramEnd"/>
-      <w:r>
-        <w:rPr>
-          <w:highlight w:val="yellow"/>
-        </w:rPr>
-        <w:t>) syntax puts the four objects into an array, which is stored in $people. The Format-Table -</w:t>
-      </w:r>
-      <w:proofErr w:type="spellStart"/>
-      <w:r>
-        <w:rPr>
-          <w:highlight w:val="yellow"/>
-        </w:rPr>
-        <w:t>AutoSize</w:t>
-      </w:r>
-      <w:proofErr w:type="spellEnd"/>
-      <w:r>
-        <w:rPr>
-          <w:highlight w:val="yellow"/>
-        </w:rPr>
-        <w:t xml:space="preserve"> option shows the information in a nice table for inspection before exporting.  </w:t>
-      </w:r>
-      <w:r>
-        <w:rPr>
-          <w:highlight w:val="yellow"/>
-        </w:rPr>
-        <w:t xml:space="preserve">Then, I </w:t>
-      </w:r>
-      <w:r>
-        <w:rPr>
-          <w:highlight w:val="yellow"/>
-        </w:rPr>
-        <w:t>added the people data to the ProcessInfo.xlsx file using Export-Excel. The -Append parameter allows me to append the data to the existing file; the -</w:t>
-      </w:r>
-      <w:proofErr w:type="spellStart"/>
-      <w:r>
-        <w:rPr>
-          <w:highlight w:val="yellow"/>
-        </w:rPr>
-        <w:t>WorksheetName</w:t>
-      </w:r>
-      <w:proofErr w:type="spellEnd"/>
-      <w:r>
-        <w:rPr>
-          <w:highlight w:val="yellow"/>
-        </w:rPr>
-        <w:t xml:space="preserve"> "People" parameter puts the data on a sheet named "People. I could replace the file without -Append and loose the Processes worksheet. The Name and City columns are formatted to display in four rows with Format-Table. Typically, the export command will not generate any output if successful. I then imported the People worksheet using Import-Excel. The same four persons appear in the output which tells that the data was added and can be read back.</w:t>
-      </w:r>
-    </w:p>
-    <w:p>
-      <w:pPr>
-        <w:spacing w:after="120" w:line="276" w:lineRule="auto"/>
-      </w:pPr>
-    </w:p>
-    <w:p>
-      <w:pPr>
-        <w:spacing w:after="120" w:line="276" w:lineRule="auto"/>
-        <w:rPr>
-          <w:b/>
-          <w:bCs/>
-        </w:rPr>
-      </w:pPr>
-      <w:r>
-        <w:rPr>
-          <w:b/>
-          <w:bCs/>
-        </w:rPr>
-        <w:t>Step 8: Export Data with Formatting</w:t>
-      </w:r>
-    </w:p>
-    <w:p>
-      <w:pPr>
-        <w:spacing w:after="120" w:line="276" w:lineRule="auto"/>
-      </w:pPr>
-      <w:r>
-        <w:lastRenderedPageBreak/>
-        <w:drawing>
-          <wp:inline distT="0" distB="0" distL="0" distR="0" wp14:anchorId="313B67E4" wp14:editId="1E41093C">
-            <wp:extent cx="5943600" cy="3714750"/>
-            <wp:effectExtent l="0" t="0" r="0" b="0"/>
-            <wp:docPr id="1313288555" name="Picture 1"/>
-            <wp:cNvGraphicFramePr>
-              <a:graphicFrameLocks xmlns:a="http://schemas.openxmlformats.org/drawingml/2006/main" noChangeAspect="1"/>
-            </wp:cNvGraphicFramePr>
-            <a:graphic xmlns:a="http://schemas.openxmlformats.org/drawingml/2006/main">
-              <a:graphicData uri="http://schemas.openxmlformats.org/drawingml/2006/picture">
-                <pic:pic xmlns:pic="http://schemas.openxmlformats.org/drawingml/2006/picture">
-                  <pic:nvPicPr>
-                    <pic:cNvPr id="1313288555" name=""/>
                     <pic:cNvPicPr/>
                   </pic:nvPicPr>
                   <pic:blipFill>
@@ -1463,13 +1197,148 @@
         <w:rPr>
           <w:highlight w:val="yellow"/>
         </w:rPr>
-        <w:t>In t</w:t>
-      </w:r>
-      <w:r>
-        <w:rPr>
-          <w:highlight w:val="yellow"/>
-        </w:rPr>
-        <w:t>his step, I have exported a more organized spreadsheet rather than a simple line-by-line export as this would be impossible to use for the purposes of this process. If it is not present, New-Item will create the folder C:\temp. If the folder exists, the -Force parameter is used to prevent an error. The export command also takes the following arguments: -</w:t>
+        <w:t>My first step was to make a little table with four people and their cities. The [</w:t>
+      </w:r>
+      <w:proofErr w:type="spellStart"/>
+      <w:r>
+        <w:rPr>
+          <w:highlight w:val="yellow"/>
+        </w:rPr>
+        <w:t>PSCustomObject</w:t>
+      </w:r>
+      <w:proofErr w:type="spellEnd"/>
+      <w:r>
+        <w:rPr>
+          <w:highlight w:val="yellow"/>
+        </w:rPr>
+        <w:t xml:space="preserve">] block represents one object, each containing a Name and City. The </w:t>
+      </w:r>
+      <w:proofErr w:type="gramStart"/>
+      <w:r>
+        <w:rPr>
+          <w:highlight w:val="yellow"/>
+        </w:rPr>
+        <w:t>@(</w:t>
+      </w:r>
+      <w:proofErr w:type="gramEnd"/>
+      <w:r>
+        <w:rPr>
+          <w:highlight w:val="yellow"/>
+        </w:rPr>
+        <w:t>) syntax puts the four objects into an array, which is stored in $people. The Format-Table -</w:t>
+      </w:r>
+      <w:proofErr w:type="spellStart"/>
+      <w:r>
+        <w:rPr>
+          <w:highlight w:val="yellow"/>
+        </w:rPr>
+        <w:t>AutoSize</w:t>
+      </w:r>
+      <w:proofErr w:type="spellEnd"/>
+      <w:r>
+        <w:rPr>
+          <w:highlight w:val="yellow"/>
+        </w:rPr>
+        <w:t xml:space="preserve"> option shows the information in a nice table for inspection before exporting.  Then, I added the people data to the ProcessInfo.xlsx file using Export-Excel. The -Append parameter allows me to append the data to the existing file; the -</w:t>
+      </w:r>
+      <w:proofErr w:type="spellStart"/>
+      <w:r>
+        <w:rPr>
+          <w:highlight w:val="yellow"/>
+        </w:rPr>
+        <w:t>WorksheetName</w:t>
+      </w:r>
+      <w:proofErr w:type="spellEnd"/>
+      <w:r>
+        <w:rPr>
+          <w:highlight w:val="yellow"/>
+        </w:rPr>
+        <w:t xml:space="preserve"> "People" parameter puts the data on a sheet named "People. I could replace the file without -Append and loose the Processes worksheet. The Name and City columns are formatted to display in four rows with Format-Table. Typically, the export command will not generate any output if successful. I then imported the People worksheet using Import-Excel. The same four persons appear in the output which tells that the data was added and can be read back.</w:t>
+      </w:r>
+    </w:p>
+    <w:p>
+      <w:pPr>
+        <w:spacing w:after="120" w:line="276" w:lineRule="auto"/>
+      </w:pPr>
+    </w:p>
+    <w:p>
+      <w:pPr>
+        <w:spacing w:after="120" w:line="276" w:lineRule="auto"/>
+        <w:rPr>
+          <w:b/>
+          <w:bCs/>
+        </w:rPr>
+      </w:pPr>
+      <w:r>
+        <w:rPr>
+          <w:b/>
+          <w:bCs/>
+        </w:rPr>
+        <w:t>Step 8: Export Data with Formatting</w:t>
+      </w:r>
+    </w:p>
+    <w:p>
+      <w:pPr>
+        <w:spacing w:after="120" w:line="276" w:lineRule="auto"/>
+      </w:pPr>
+      <w:r>
+        <w:rPr>
+          <w:noProof/>
+        </w:rPr>
+        <w:lastRenderedPageBreak/>
+        <w:drawing>
+          <wp:inline distT="0" distB="0" distL="0" distR="0" wp14:anchorId="313B67E4" wp14:editId="1E41093C">
+            <wp:extent cx="5943600" cy="3714750"/>
+            <wp:effectExtent l="0" t="0" r="0" b="0"/>
+            <wp:docPr id="1313288555" name="Picture 1"/>
+            <wp:cNvGraphicFramePr>
+              <a:graphicFrameLocks xmlns:a="http://schemas.openxmlformats.org/drawingml/2006/main" noChangeAspect="1"/>
+            </wp:cNvGraphicFramePr>
+            <a:graphic xmlns:a="http://schemas.openxmlformats.org/drawingml/2006/main">
+              <a:graphicData uri="http://schemas.openxmlformats.org/drawingml/2006/picture">
+                <pic:pic xmlns:pic="http://schemas.openxmlformats.org/drawingml/2006/picture">
+                  <pic:nvPicPr>
+                    <pic:cNvPr id="1313288555" name=""/>
+                    <pic:cNvPicPr/>
+                  </pic:nvPicPr>
+                  <pic:blipFill>
+                    <a:blip r:embed="rId12"/>
+                    <a:stretch>
+                      <a:fillRect/>
+                    </a:stretch>
+                  </pic:blipFill>
+                  <pic:spPr>
+                    <a:xfrm>
+                      <a:off x="0" y="0"/>
+                      <a:ext cx="5943600" cy="3714750"/>
+                    </a:xfrm>
+                    <a:prstGeom prst="rect">
+                      <a:avLst/>
+                    </a:prstGeom>
+                  </pic:spPr>
+                </pic:pic>
+              </a:graphicData>
+            </a:graphic>
+          </wp:inline>
+        </w:drawing>
+      </w:r>
+    </w:p>
+    <w:p>
+      <w:pPr>
+        <w:spacing w:after="120" w:line="276" w:lineRule="auto"/>
+      </w:pPr>
+      <w:r>
+        <w:rPr>
+          <w:b/>
+          <w:bCs/>
+        </w:rPr>
+        <w:t xml:space="preserve">Output: </w:t>
+      </w:r>
+      <w:r>
+        <w:rPr>
+          <w:highlight w:val="yellow"/>
+        </w:rPr>
+        <w:t>In this step, I have exported a more organized spreadsheet rather than a simple line-by-line export as this would be impossible to use for the purposes of this process. If it is not present, New-Item will create the folder C:\temp. If the folder exists, the -Force parameter is used to prevent an error. The export command also takes the following arguments: -</w:t>
       </w:r>
       <w:proofErr w:type="spellStart"/>
       <w:r>
@@ -1667,7 +1536,7 @@
                     </pic:cNvPicPr>
                   </pic:nvPicPr>
                   <pic:blipFill>
-                    <a:blip r:embed="rId12">
+                    <a:blip r:embed="rId13">
                       <a:extLst>
                         <a:ext uri="{28A0092B-C50C-407E-A947-70E740481C1C}">
                           <a14:useLocalDpi xmlns:a14="http://schemas.microsoft.com/office/drawing/2010/main" val="0"/>
@@ -1742,6 +1611,7 @@
         <w:rPr>
           <w:b/>
           <w:bCs/>
+          <w:noProof/>
         </w:rPr>
         <w:lastRenderedPageBreak/>
         <w:drawing>
@@ -1760,7 +1630,7 @@
                     <pic:cNvPicPr/>
                   </pic:nvPicPr>
                   <pic:blipFill>
-                    <a:blip r:embed="rId13"/>
+                    <a:blip r:embed="rId14"/>
                     <a:stretch>
                       <a:fillRect/>
                     </a:stretch>
@@ -3104,6 +2974,29 @@
       <w:rFonts w:ascii="Times New Roman" w:hAnsi="Times New Roman" w:cs="Times New Roman"/>
     </w:rPr>
   </w:style>
+  <w:style w:type="character" w:styleId="Hyperlink">
+    <w:name w:val="Hyperlink"/>
+    <w:basedOn w:val="DefaultParagraphFont"/>
+    <w:uiPriority w:val="99"/>
+    <w:unhideWhenUsed/>
+    <w:rsid w:val="00C6374F"/>
+    <w:rPr>
+      <w:color w:val="467886" w:themeColor="hyperlink"/>
+      <w:u w:val="single"/>
+    </w:rPr>
+  </w:style>
+  <w:style w:type="character" w:styleId="UnresolvedMention">
+    <w:name w:val="Unresolved Mention"/>
+    <w:basedOn w:val="DefaultParagraphFont"/>
+    <w:uiPriority w:val="99"/>
+    <w:semiHidden/>
+    <w:unhideWhenUsed/>
+    <w:rsid w:val="00C6374F"/>
+    <w:rPr>
+      <w:color w:val="605E5C"/>
+      <w:shd w:val="clear" w:color="auto" w:fill="E1DFDD"/>
+    </w:rPr>
+  </w:style>
 </w:styles>
 </file>
 

</xml_diff>